<commit_message>
Update Konfigurációk.docx from dokumentációk
Made-with: Cursor
</commit_message>
<xml_diff>
--- a/Konfigurációk.docx
+++ b/Konfigurációk.docx
@@ -1518,357 +1518,124 @@
     <w:p>
       <w:pPr>
         <w:rPr>
-          <w:b/>
-          <w:bCs/>
-          <w:sz w:val="32"/>
-          <w:szCs w:val="32"/>
-        </w:rPr>
-      </w:pPr>
-      <w:r>
-        <w:rPr>
-          <w:b/>
-          <w:bCs/>
-          <w:sz w:val="32"/>
-          <w:szCs w:val="32"/>
-        </w:rPr>
-        <w:t>Adminisztrativ</w:t>
-      </w:r>
-    </w:p>
-    <w:p>
-      <w:pPr>
-        <w:rPr>
-          <w:b/>
-          <w:bCs/>
-        </w:rPr>
-      </w:pPr>
-      <w:r>
-        <w:rPr>
-          <w:b/>
-          <w:bCs/>
-        </w:rPr>
-        <w:t>Alap</w:t>
-      </w:r>
-    </w:p>
-    <w:p>
-      <w:pPr>
-        <w:numPr>
-          <w:ilvl w:val="0"/>
-          <w:numId w:val="15"/>
-        </w:numPr>
-      </w:pPr>
-      <w:r>
-        <w:rPr>
-          <w:b/>
-          <w:bCs/>
-        </w:rPr>
-        <w:t>Hostname:</w:t>
-      </w:r>
-      <w:r>
-        <w:t> ADMINISZTRATIV</w:t>
-      </w:r>
-    </w:p>
-    <w:p>
-      <w:pPr>
-        <w:numPr>
-          <w:ilvl w:val="0"/>
-          <w:numId w:val="15"/>
-        </w:numPr>
-      </w:pPr>
-      <w:r>
-        <w:rPr>
-          <w:b/>
-          <w:bCs/>
-        </w:rPr>
-        <w:t>IOS verzió:</w:t>
-      </w:r>
-      <w:r>
-        <w:t> 15.1</w:t>
-      </w:r>
-    </w:p>
-    <w:p>
-      <w:pPr>
-        <w:numPr>
-          <w:ilvl w:val="0"/>
-          <w:numId w:val="15"/>
-        </w:numPr>
-      </w:pPr>
-      <w:r>
-        <w:rPr>
-          <w:b/>
-          <w:bCs/>
-        </w:rPr>
-        <w:t>DHCP szerver:</w:t>
-      </w:r>
-      <w:r>
-        <w:t> működik a helyi adminisztratív hálózat számára</w:t>
-      </w:r>
-    </w:p>
-    <w:p>
-      <w:pPr>
-        <w:numPr>
-          <w:ilvl w:val="0"/>
-          <w:numId w:val="15"/>
-        </w:numPr>
-      </w:pPr>
-      <w:r>
-        <w:rPr>
-          <w:b/>
-          <w:bCs/>
+          <w:rFonts w:ascii="-webkit-standard" w:hAnsi="-webkit-standard"/>
+          <w:b/>
+          <w:bCs/>
+          <w:color w:val="000000"/>
+          <w:sz w:val="28"/>
+          <w:szCs w:val="28"/>
+          <w:u w:val="single"/>
+        </w:rPr>
+      </w:pPr>
+      <w:r>
+        <w:rPr>
+          <w:rFonts w:ascii="-webkit-standard" w:hAnsi="-webkit-standard"/>
+          <w:b/>
+          <w:bCs/>
+          <w:color w:val="000000"/>
+          <w:sz w:val="28"/>
+          <w:szCs w:val="28"/>
+          <w:u w:val="single"/>
+        </w:rPr>
+        <w:t>MENEDZSMENT SWITCH</w:t>
+      </w:r>
+    </w:p>
+    <w:p>
+      <w:pPr>
+        <w:pStyle w:val="NormlWeb"/>
+        <w:rPr>
+          <w:color w:val="000000"/>
+        </w:rPr>
+      </w:pPr>
+      <w:r>
+        <w:rPr>
+          <w:color w:val="000000"/>
+        </w:rPr>
+        <w:t>VLAN 10</w:t>
+      </w:r>
+      <w:r>
+        <w:rPr>
+          <w:color w:val="000000"/>
+        </w:rPr>
+        <w:br/>
+        <w:t>VLAN 20</w:t>
+      </w:r>
+    </w:p>
+    <w:p>
+      <w:pPr>
+        <w:pStyle w:val="NormlWeb"/>
+        <w:rPr>
+          <w:color w:val="000000"/>
+        </w:rPr>
+      </w:pPr>
+    </w:p>
+    <w:p>
+      <w:pPr>
+        <w:pStyle w:val="NormlWeb"/>
+        <w:rPr>
+          <w:color w:val="000000"/>
+        </w:rPr>
+      </w:pPr>
+    </w:p>
+    <w:p>
+      <w:pPr>
+        <w:pStyle w:val="NormlWeb"/>
+        <w:rPr>
+          <w:b/>
+          <w:bCs/>
+          <w:color w:val="000000"/>
+        </w:rPr>
+      </w:pPr>
+      <w:r>
+        <w:rPr>
+          <w:b/>
+          <w:bCs/>
+          <w:color w:val="000000"/>
         </w:rPr>
         <w:lastRenderedPageBreak/>
-        <w:t>PC IP tartomány:</w:t>
-      </w:r>
-      <w:r>
-        <w:t xml:space="preserve"> 192.168.4.100-105/24</w:t>
-      </w:r>
-    </w:p>
-    <w:p>
-      <w:pPr>
-        <w:rPr>
-          <w:b/>
-          <w:bCs/>
-        </w:rPr>
-      </w:pPr>
-      <w:r>
-        <w:rPr>
-          <w:b/>
-          <w:bCs/>
-        </w:rPr>
-        <w:t>Interfészek (csak ahol IP van / eltérés van)</w:t>
-      </w:r>
-    </w:p>
-    <w:p>
-      <w:pPr>
-        <w:numPr>
-          <w:ilvl w:val="0"/>
-          <w:numId w:val="16"/>
-        </w:numPr>
-      </w:pPr>
-      <w:r>
-        <w:rPr>
-          <w:b/>
-          <w:bCs/>
-        </w:rPr>
-        <w:t>GigabitEthernet0/0:</w:t>
-      </w:r>
-      <w:r>
-        <w:t> 10.0.16.1/30 — kapcsolat az ASA tűzfal felé</w:t>
-      </w:r>
-    </w:p>
-    <w:p>
-      <w:pPr>
-        <w:numPr>
-          <w:ilvl w:val="0"/>
-          <w:numId w:val="16"/>
-        </w:numPr>
-      </w:pPr>
-      <w:r>
-        <w:rPr>
-          <w:b/>
-          <w:bCs/>
-        </w:rPr>
-        <w:t>Serial0/0/0:</w:t>
-      </w:r>
-      <w:r>
-        <w:t> 10.0.0.46/30</w:t>
-      </w:r>
-    </w:p>
-    <w:p>
-      <w:pPr>
-        <w:numPr>
-          <w:ilvl w:val="0"/>
-          <w:numId w:val="16"/>
-        </w:numPr>
-      </w:pPr>
-      <w:r>
-        <w:rPr>
-          <w:b/>
-          <w:bCs/>
-        </w:rPr>
-        <w:t>Serial0/1/0:</w:t>
-      </w:r>
-      <w:r>
-        <w:t> 10.0.0.18/30</w:t>
-      </w:r>
-    </w:p>
-    <w:p>
-      <w:pPr>
-        <w:numPr>
-          <w:ilvl w:val="0"/>
-          <w:numId w:val="16"/>
-        </w:numPr>
-      </w:pPr>
-      <w:r>
-        <w:rPr>
-          <w:b/>
-          <w:bCs/>
-        </w:rPr>
-        <w:t>Serial0/1/1:</w:t>
-      </w:r>
-      <w:r>
-        <w:t> 10.0.0.21/30</w:t>
-      </w:r>
-    </w:p>
-    <w:p>
-      <w:pPr>
-        <w:rPr>
-          <w:b/>
-          <w:bCs/>
-        </w:rPr>
-      </w:pPr>
-      <w:r>
-        <w:rPr>
-          <w:b/>
-          <w:bCs/>
-        </w:rPr>
-        <w:t>Routing</w:t>
-      </w:r>
-    </w:p>
-    <w:p>
-      <w:pPr>
-        <w:numPr>
-          <w:ilvl w:val="0"/>
-          <w:numId w:val="17"/>
-        </w:numPr>
-      </w:pPr>
-      <w:r>
-        <w:rPr>
-          <w:b/>
-          <w:bCs/>
-        </w:rPr>
-        <w:t>RIP v2</w:t>
-      </w:r>
-    </w:p>
-    <w:p>
-      <w:pPr>
-        <w:numPr>
-          <w:ilvl w:val="1"/>
-          <w:numId w:val="17"/>
-        </w:numPr>
-      </w:pPr>
-      <w:r>
-        <w:t>Hirdetett hálók:</w:t>
-      </w:r>
-    </w:p>
-    <w:p>
-      <w:pPr>
-        <w:numPr>
-          <w:ilvl w:val="2"/>
-          <w:numId w:val="17"/>
-        </w:numPr>
-      </w:pPr>
-      <w:r>
-        <w:t>10.0.0.0</w:t>
-      </w:r>
-    </w:p>
-    <w:p>
-      <w:pPr>
-        <w:numPr>
-          <w:ilvl w:val="2"/>
-          <w:numId w:val="17"/>
-        </w:numPr>
-      </w:pPr>
-      <w:r>
-        <w:t>192.168.4.0</w:t>
-      </w:r>
-    </w:p>
-    <w:p>
-      <w:pPr>
-        <w:numPr>
-          <w:ilvl w:val="0"/>
-          <w:numId w:val="17"/>
-        </w:numPr>
-      </w:pPr>
-      <w:r>
-        <w:rPr>
-          <w:b/>
-          <w:bCs/>
-        </w:rPr>
-        <w:t>Statikus útvonal:</w:t>
-      </w:r>
-    </w:p>
-    <w:p>
-      <w:pPr>
-        <w:numPr>
-          <w:ilvl w:val="1"/>
-          <w:numId w:val="17"/>
-        </w:numPr>
-      </w:pPr>
-      <w:r>
-        <w:t>192.168.4.0/24 → 10.0.16.2 </w:t>
-      </w:r>
-      <w:r>
-        <w:rPr>
-          <w:i/>
-          <w:iCs/>
-        </w:rPr>
-        <w:t>(ASA tűzfal inside interfész felé, adminisztratív LAN eléréshez)</w:t>
-      </w:r>
-    </w:p>
-    <w:p>
-      <w:pPr>
-        <w:rPr>
-          <w:b/>
-          <w:bCs/>
-        </w:rPr>
-      </w:pPr>
-      <w:r>
-        <w:rPr>
-          <w:b/>
-          <w:bCs/>
-        </w:rPr>
-        <w:t>DHCP</w:t>
-      </w:r>
-    </w:p>
-    <w:p>
-      <w:pPr>
-        <w:numPr>
-          <w:ilvl w:val="0"/>
-          <w:numId w:val="18"/>
-        </w:numPr>
-      </w:pPr>
-      <w:r>
-        <w:rPr>
-          <w:b/>
-          <w:bCs/>
-        </w:rPr>
-        <w:t>Pool neve:</w:t>
-      </w:r>
-      <w:r>
-        <w:t> adminisztrativ</w:t>
-      </w:r>
-    </w:p>
-    <w:p>
-      <w:pPr>
-        <w:numPr>
-          <w:ilvl w:val="1"/>
-          <w:numId w:val="18"/>
-        </w:numPr>
-      </w:pPr>
-      <w:r>
-        <w:t>Hálózat: 192.168.4.0/24</w:t>
-      </w:r>
-    </w:p>
-    <w:p>
-      <w:pPr>
-        <w:numPr>
-          <w:ilvl w:val="1"/>
-          <w:numId w:val="18"/>
-        </w:numPr>
-      </w:pPr>
-      <w:r>
-        <w:t>Alapértelmezett átjáró: 192.168.4.254</w:t>
-      </w:r>
-    </w:p>
-    <w:p>
-      <w:pPr>
-        <w:numPr>
-          <w:ilvl w:val="1"/>
-          <w:numId w:val="18"/>
-        </w:numPr>
-      </w:pPr>
-      <w:r>
-        <w:t>DNS-szerver: 10.100.100.3</w:t>
+        <w:t>Trunk a router felé:</w:t>
+      </w:r>
+    </w:p>
+    <w:p>
+      <w:pPr>
+        <w:pStyle w:val="NormlWeb"/>
+        <w:rPr>
+          <w:color w:val="000000"/>
+        </w:rPr>
+      </w:pPr>
+      <w:r>
+        <w:rPr>
+          <w:color w:val="000000"/>
+        </w:rPr>
+        <w:t>interface Fa0/1</w:t>
+      </w:r>
+      <w:r>
+        <w:rPr>
+          <w:color w:val="000000"/>
+        </w:rPr>
+        <w:br/>
+        <w:t>switchport mode trunk</w:t>
+      </w:r>
+      <w:r>
+        <w:rPr>
+          <w:color w:val="000000"/>
+        </w:rPr>
+        <w:br/>
+        <w:t>switchport trunk allowed vlan 10,20</w:t>
+      </w:r>
+    </w:p>
+    <w:p>
+      <w:pPr>
+        <w:pStyle w:val="NormlWeb"/>
+        <w:rPr>
+          <w:color w:val="000000"/>
+        </w:rPr>
+      </w:pPr>
+      <w:r>
+        <w:rPr>
+          <w:color w:val="000000"/>
+        </w:rPr>
+        <w:t>Access portok szétosztva VLAN10 és VLAN20 szerint.</w:t>
       </w:r>
     </w:p>
     <w:p>
@@ -1889,7 +1656,7 @@
           <w:szCs w:val="32"/>
           <w:u w:val="single"/>
         </w:rPr>
-        <w:t>SZERVERKÖZPONT</w:t>
+        <w:t>Adminisztrativ</w:t>
       </w:r>
     </w:p>
     <w:p>
@@ -1911,7 +1678,7 @@
       <w:pPr>
         <w:numPr>
           <w:ilvl w:val="0"/>
-          <w:numId w:val="19"/>
+          <w:numId w:val="15"/>
         </w:numPr>
       </w:pPr>
       <w:r>
@@ -1922,14 +1689,14 @@
         <w:t>Hostname:</w:t>
       </w:r>
       <w:r>
-        <w:t> SZERVERKOZPONT</w:t>
+        <w:t> ADMINISZTRATIV</w:t>
       </w:r>
     </w:p>
     <w:p>
       <w:pPr>
         <w:numPr>
           <w:ilvl w:val="0"/>
-          <w:numId w:val="19"/>
+          <w:numId w:val="15"/>
         </w:numPr>
       </w:pPr>
       <w:r>
@@ -1940,7 +1707,43 @@
         <w:t>IOS verzió:</w:t>
       </w:r>
       <w:r>
-        <w:t> 12.4</w:t>
+        <w:t> 15.1</w:t>
+      </w:r>
+    </w:p>
+    <w:p>
+      <w:pPr>
+        <w:numPr>
+          <w:ilvl w:val="0"/>
+          <w:numId w:val="15"/>
+        </w:numPr>
+      </w:pPr>
+      <w:r>
+        <w:rPr>
+          <w:b/>
+          <w:bCs/>
+        </w:rPr>
+        <w:t>DHCP szerver:</w:t>
+      </w:r>
+      <w:r>
+        <w:t> működik a helyi adminisztratív hálózat számára</w:t>
+      </w:r>
+    </w:p>
+    <w:p>
+      <w:pPr>
+        <w:numPr>
+          <w:ilvl w:val="0"/>
+          <w:numId w:val="15"/>
+        </w:numPr>
+      </w:pPr>
+      <w:r>
+        <w:rPr>
+          <w:b/>
+          <w:bCs/>
+        </w:rPr>
+        <w:t>PC IP tartomány:</w:t>
+      </w:r>
+      <w:r>
+        <w:t xml:space="preserve"> 192.168.4.100-105/24</w:t>
       </w:r>
     </w:p>
     <w:p>
@@ -1962,25 +1765,72 @@
       <w:pPr>
         <w:numPr>
           <w:ilvl w:val="0"/>
-          <w:numId w:val="20"/>
-        </w:numPr>
-      </w:pPr>
-      <w:r>
-        <w:rPr>
-          <w:b/>
-          <w:bCs/>
-        </w:rPr>
-        <w:t>FastEthernet0/0:</w:t>
-      </w:r>
-      <w:r>
-        <w:t> 10.100.100.1/24 </w:t>
+          <w:numId w:val="16"/>
+        </w:numPr>
+      </w:pPr>
+      <w:r>
+        <w:rPr>
+          <w:b/>
+          <w:bCs/>
+        </w:rPr>
+        <w:t>GigabitEthernet0/0:</w:t>
+      </w:r>
+      <w:r>
+        <w:t> 10.0.16.1/30 — kapcsolat az ASA tűzfal felé</w:t>
       </w:r>
     </w:p>
     <w:p>
       <w:pPr>
         <w:numPr>
           <w:ilvl w:val="0"/>
-          <w:numId w:val="20"/>
+          <w:numId w:val="16"/>
+        </w:numPr>
+        <w:rPr>
+          <w:b/>
+          <w:bCs/>
+        </w:rPr>
+      </w:pPr>
+      <w:r>
+        <w:rPr>
+          <w:b/>
+          <w:bCs/>
+        </w:rPr>
+        <w:t>GigabitEthernet0</w:t>
+      </w:r>
+      <w:r>
+        <w:rPr>
+          <w:b/>
+          <w:bCs/>
+        </w:rPr>
+        <w:t xml:space="preserve">/1: </w:t>
+      </w:r>
+      <w:r>
+        <w:t>192.168.4.254/24</w:t>
+      </w:r>
+    </w:p>
+    <w:p>
+      <w:pPr>
+        <w:numPr>
+          <w:ilvl w:val="0"/>
+          <w:numId w:val="16"/>
+        </w:numPr>
+      </w:pPr>
+      <w:r>
+        <w:rPr>
+          <w:b/>
+          <w:bCs/>
+        </w:rPr>
+        <w:t>Serial0/0/0:</w:t>
+      </w:r>
+      <w:r>
+        <w:t> 10.0.0.46/30</w:t>
+      </w:r>
+    </w:p>
+    <w:p>
+      <w:pPr>
+        <w:numPr>
+          <w:ilvl w:val="0"/>
+          <w:numId w:val="16"/>
         </w:numPr>
       </w:pPr>
       <w:r>
@@ -1991,14 +1841,14 @@
         <w:t>Serial0/1/0:</w:t>
       </w:r>
       <w:r>
-        <w:t> 10.0.0.14/30 </w:t>
+        <w:t> 10.0.0.18/30</w:t>
       </w:r>
     </w:p>
     <w:p>
       <w:pPr>
         <w:numPr>
           <w:ilvl w:val="0"/>
-          <w:numId w:val="20"/>
+          <w:numId w:val="16"/>
         </w:numPr>
       </w:pPr>
       <w:r>
@@ -2009,7 +1859,7 @@
         <w:t>Serial0/1/1:</w:t>
       </w:r>
       <w:r>
-        <w:t> 10.0.0.17/30</w:t>
+        <w:t> 10.0.0.21/30</w:t>
       </w:r>
     </w:p>
     <w:p>
@@ -2031,148 +1881,155 @@
       <w:pPr>
         <w:numPr>
           <w:ilvl w:val="0"/>
-          <w:numId w:val="21"/>
-        </w:numPr>
-      </w:pPr>
-      <w:r>
-        <w:rPr>
-          <w:b/>
-          <w:bCs/>
-        </w:rPr>
+          <w:numId w:val="17"/>
+        </w:numPr>
+      </w:pPr>
+      <w:r>
+        <w:rPr>
+          <w:b/>
+          <w:bCs/>
+        </w:rPr>
+        <w:t>RIP v2</w:t>
+      </w:r>
+    </w:p>
+    <w:p>
+      <w:pPr>
+        <w:numPr>
+          <w:ilvl w:val="1"/>
+          <w:numId w:val="17"/>
+        </w:numPr>
+      </w:pPr>
+      <w:r>
+        <w:t>Hirdetett hálók:</w:t>
+      </w:r>
+    </w:p>
+    <w:p>
+      <w:pPr>
+        <w:numPr>
+          <w:ilvl w:val="2"/>
+          <w:numId w:val="17"/>
+        </w:numPr>
+      </w:pPr>
+      <w:r>
+        <w:t>10.0.0.0</w:t>
+      </w:r>
+    </w:p>
+    <w:p>
+      <w:pPr>
+        <w:numPr>
+          <w:ilvl w:val="2"/>
+          <w:numId w:val="17"/>
+        </w:numPr>
+      </w:pPr>
+      <w:r>
+        <w:t>192.168.4.0</w:t>
+      </w:r>
+    </w:p>
+    <w:p>
+      <w:pPr>
+        <w:numPr>
+          <w:ilvl w:val="0"/>
+          <w:numId w:val="17"/>
+        </w:numPr>
+      </w:pPr>
+      <w:r>
+        <w:rPr>
+          <w:b/>
+          <w:bCs/>
+        </w:rPr>
+        <w:t>Statikus útvonal:</w:t>
+      </w:r>
+    </w:p>
+    <w:p>
+      <w:pPr>
+        <w:numPr>
+          <w:ilvl w:val="1"/>
+          <w:numId w:val="17"/>
+        </w:numPr>
+      </w:pPr>
+      <w:r>
+        <w:t>192.168.4.0/24 → 10.0.16.2 </w:t>
+      </w:r>
+      <w:r>
+        <w:rPr>
+          <w:i/>
+          <w:iCs/>
+        </w:rPr>
+        <w:t>(ASA tűzfal inside interfész felé, adminisztratív LAN eléréshez)</w:t>
+      </w:r>
+    </w:p>
+    <w:p>
+      <w:pPr>
+        <w:rPr>
+          <w:b/>
+          <w:bCs/>
+        </w:rPr>
+      </w:pPr>
+      <w:r>
+        <w:rPr>
+          <w:b/>
+          <w:bCs/>
+        </w:rPr>
+        <w:t>DHCP</w:t>
+      </w:r>
+    </w:p>
+    <w:p>
+      <w:pPr>
+        <w:numPr>
+          <w:ilvl w:val="0"/>
+          <w:numId w:val="18"/>
+        </w:numPr>
+      </w:pPr>
+      <w:r>
+        <w:rPr>
+          <w:b/>
+          <w:bCs/>
+        </w:rPr>
+        <w:t>Pool neve:</w:t>
+      </w:r>
+      <w:r>
+        <w:t> adminisztrativ</w:t>
+      </w:r>
+    </w:p>
+    <w:p>
+      <w:pPr>
+        <w:numPr>
+          <w:ilvl w:val="1"/>
+          <w:numId w:val="18"/>
+        </w:numPr>
+      </w:pPr>
+      <w:r>
+        <w:t>Hálózat: 192.168.4.0/24</w:t>
+      </w:r>
+    </w:p>
+    <w:p>
+      <w:pPr>
+        <w:numPr>
+          <w:ilvl w:val="1"/>
+          <w:numId w:val="18"/>
+        </w:numPr>
+      </w:pPr>
+      <w:r>
+        <w:t>Alapértelmezett átjáró: 192.168.4.254</w:t>
+      </w:r>
+    </w:p>
+    <w:p>
+      <w:pPr>
+        <w:numPr>
+          <w:ilvl w:val="1"/>
+          <w:numId w:val="18"/>
+        </w:numPr>
+      </w:pPr>
+      <w:r>
         <w:lastRenderedPageBreak/>
-        <w:t>RIP v2</w:t>
-      </w:r>
-    </w:p>
-    <w:p>
-      <w:pPr>
-        <w:numPr>
-          <w:ilvl w:val="1"/>
-          <w:numId w:val="21"/>
-        </w:numPr>
-      </w:pPr>
-      <w:r>
-        <w:t>Hirdetett hálók:</w:t>
-      </w:r>
-    </w:p>
-    <w:p>
-      <w:pPr>
-        <w:numPr>
-          <w:ilvl w:val="2"/>
-          <w:numId w:val="21"/>
-        </w:numPr>
-      </w:pPr>
-      <w:r>
-        <w:t>10.0.0.0</w:t>
-      </w:r>
-    </w:p>
-    <w:p/>
-    <w:p/>
-    <w:p>
-      <w:r>
-        <w:rPr>
-          <w:b/>
-          <w:bCs/>
-        </w:rPr>
-        <w:t>FTP szerver:</w:t>
-      </w:r>
-      <w:r>
-        <w:rPr>
-          <w:b/>
-          <w:bCs/>
-        </w:rPr>
-        <w:br/>
-      </w:r>
-      <w:r>
-        <w:t>IP address: 10.100.100.2</w:t>
-      </w:r>
-      <w:r>
-        <w:br/>
-        <w:t>Subnet Mask: 255.255.255.0</w:t>
-      </w:r>
-      <w:r>
-        <w:br/>
-        <w:t>Default Gateway: 10.100.100.1</w:t>
-      </w:r>
-      <w:r>
-        <w:br/>
-        <w:t>DNS server: 8.8.8.8</w:t>
-      </w:r>
-    </w:p>
-    <w:p>
-      <w:r>
-        <w:rPr>
-          <w:b/>
-          <w:bCs/>
-        </w:rPr>
-        <w:t>DNS server:</w:t>
-      </w:r>
-      <w:r>
-        <w:rPr>
-          <w:b/>
-          <w:bCs/>
-        </w:rPr>
-        <w:br/>
-      </w:r>
-      <w:r>
-        <w:t>IP address: 10.100.100.3</w:t>
-      </w:r>
-      <w:r>
-        <w:br/>
-        <w:t>Subnet Mask: 255.255.255.0</w:t>
-      </w:r>
-      <w:r>
-        <w:br/>
-        <w:t>Default Gateway: 10.100.100.1</w:t>
-      </w:r>
-      <w:r>
-        <w:br/>
-        <w:t>DNS server: 8.8.8.8</w:t>
-      </w:r>
-      <w:r>
-        <w:br/>
-      </w:r>
-    </w:p>
-    <w:p>
-      <w:r>
-        <w:rPr>
-          <w:b/>
-          <w:bCs/>
-        </w:rPr>
-        <w:t>WEB server:</w:t>
-      </w:r>
-      <w:r>
-        <w:rPr>
-          <w:b/>
-          <w:bCs/>
-        </w:rPr>
-        <w:br/>
-      </w:r>
-      <w:r>
-        <w:t>IP address: 10.100.100.4</w:t>
-      </w:r>
-      <w:r>
-        <w:br/>
-        <w:t>Subnet Mask: 255.255.255.0</w:t>
-      </w:r>
-      <w:r>
-        <w:br/>
-        <w:t>Default Gateway: 10.100.100.1</w:t>
-      </w:r>
-      <w:r>
-        <w:br/>
-        <w:t>DNS server: 8.8.8.8</w:t>
-      </w:r>
-      <w:r>
-        <w:br/>
-      </w:r>
-    </w:p>
-    <w:p>
-      <w:pPr>
-        <w:rPr>
-          <w:rFonts w:ascii="-webkit-standard" w:hAnsi="-webkit-standard"/>
-          <w:b/>
-          <w:bCs/>
-          <w:color w:val="000000"/>
+        <w:t>DNS-szerver: 10.100.100.3</w:t>
+      </w:r>
+    </w:p>
+    <w:p>
+      <w:pPr>
+        <w:rPr>
+          <w:b/>
+          <w:bCs/>
           <w:sz w:val="32"/>
           <w:szCs w:val="32"/>
           <w:u w:val="single"/>
@@ -2180,14 +2037,324 @@
       </w:pPr>
       <w:r>
         <w:rPr>
-          <w:rFonts w:ascii="-webkit-standard" w:hAnsi="-webkit-standard"/>
-          <w:b/>
-          <w:bCs/>
-          <w:color w:val="000000"/>
+          <w:b/>
+          <w:bCs/>
           <w:sz w:val="32"/>
           <w:szCs w:val="32"/>
           <w:u w:val="single"/>
         </w:rPr>
+        <w:t>SZERVERKÖZPONT</w:t>
+      </w:r>
+    </w:p>
+    <w:p>
+      <w:pPr>
+        <w:rPr>
+          <w:b/>
+          <w:bCs/>
+        </w:rPr>
+      </w:pPr>
+      <w:r>
+        <w:rPr>
+          <w:b/>
+          <w:bCs/>
+        </w:rPr>
+        <w:t>Alap</w:t>
+      </w:r>
+    </w:p>
+    <w:p>
+      <w:pPr>
+        <w:numPr>
+          <w:ilvl w:val="0"/>
+          <w:numId w:val="19"/>
+        </w:numPr>
+      </w:pPr>
+      <w:r>
+        <w:rPr>
+          <w:b/>
+          <w:bCs/>
+        </w:rPr>
+        <w:t>Hostname:</w:t>
+      </w:r>
+      <w:r>
+        <w:t> SZERVERKOZPONT</w:t>
+      </w:r>
+    </w:p>
+    <w:p>
+      <w:pPr>
+        <w:numPr>
+          <w:ilvl w:val="0"/>
+          <w:numId w:val="19"/>
+        </w:numPr>
+      </w:pPr>
+      <w:r>
+        <w:rPr>
+          <w:b/>
+          <w:bCs/>
+        </w:rPr>
+        <w:t>IOS verzió:</w:t>
+      </w:r>
+      <w:r>
+        <w:t> 12.4</w:t>
+      </w:r>
+    </w:p>
+    <w:p>
+      <w:pPr>
+        <w:rPr>
+          <w:b/>
+          <w:bCs/>
+        </w:rPr>
+      </w:pPr>
+      <w:r>
+        <w:rPr>
+          <w:b/>
+          <w:bCs/>
+        </w:rPr>
+        <w:t>Interfészek (csak ahol IP van / eltérés van)</w:t>
+      </w:r>
+    </w:p>
+    <w:p>
+      <w:pPr>
+        <w:numPr>
+          <w:ilvl w:val="0"/>
+          <w:numId w:val="20"/>
+        </w:numPr>
+      </w:pPr>
+      <w:r>
+        <w:rPr>
+          <w:b/>
+          <w:bCs/>
+        </w:rPr>
+        <w:t>FastEthernet0/0:</w:t>
+      </w:r>
+      <w:r>
+        <w:t> 10.100.100.1/24 </w:t>
+      </w:r>
+    </w:p>
+    <w:p>
+      <w:pPr>
+        <w:numPr>
+          <w:ilvl w:val="0"/>
+          <w:numId w:val="20"/>
+        </w:numPr>
+      </w:pPr>
+      <w:r>
+        <w:rPr>
+          <w:b/>
+          <w:bCs/>
+        </w:rPr>
+        <w:t>Serial0/1/0:</w:t>
+      </w:r>
+      <w:r>
+        <w:t> 10.0.0.14/30 </w:t>
+      </w:r>
+    </w:p>
+    <w:p>
+      <w:pPr>
+        <w:numPr>
+          <w:ilvl w:val="0"/>
+          <w:numId w:val="20"/>
+        </w:numPr>
+      </w:pPr>
+      <w:r>
+        <w:rPr>
+          <w:b/>
+          <w:bCs/>
+        </w:rPr>
+        <w:t>Serial0/1/1:</w:t>
+      </w:r>
+      <w:r>
+        <w:t> 10.0.0.17/30</w:t>
+      </w:r>
+    </w:p>
+    <w:p>
+      <w:pPr>
+        <w:rPr>
+          <w:b/>
+          <w:bCs/>
+        </w:rPr>
+      </w:pPr>
+      <w:r>
+        <w:rPr>
+          <w:b/>
+          <w:bCs/>
+        </w:rPr>
+        <w:t>Routing</w:t>
+      </w:r>
+    </w:p>
+    <w:p>
+      <w:pPr>
+        <w:numPr>
+          <w:ilvl w:val="0"/>
+          <w:numId w:val="21"/>
+        </w:numPr>
+      </w:pPr>
+      <w:r>
+        <w:rPr>
+          <w:b/>
+          <w:bCs/>
+        </w:rPr>
+        <w:t>RIP v2</w:t>
+      </w:r>
+    </w:p>
+    <w:p>
+      <w:pPr>
+        <w:numPr>
+          <w:ilvl w:val="1"/>
+          <w:numId w:val="21"/>
+        </w:numPr>
+      </w:pPr>
+      <w:r>
+        <w:t>Hirdetett hálók:</w:t>
+      </w:r>
+    </w:p>
+    <w:p>
+      <w:pPr>
+        <w:numPr>
+          <w:ilvl w:val="2"/>
+          <w:numId w:val="21"/>
+        </w:numPr>
+      </w:pPr>
+      <w:r>
+        <w:t>10.0.0.0</w:t>
+      </w:r>
+    </w:p>
+    <w:p>
+      <w:pPr>
+        <w:numPr>
+          <w:ilvl w:val="2"/>
+          <w:numId w:val="21"/>
+        </w:numPr>
+      </w:pPr>
+      <w:r>
+        <w:t>10.100.100.0</w:t>
+      </w:r>
+    </w:p>
+    <w:p/>
+    <w:p/>
+    <w:p>
+      <w:r>
+        <w:rPr>
+          <w:b/>
+          <w:bCs/>
+        </w:rPr>
+        <w:t>FTP szerver:</w:t>
+      </w:r>
+      <w:r>
+        <w:rPr>
+          <w:b/>
+          <w:bCs/>
+        </w:rPr>
+        <w:br/>
+      </w:r>
+      <w:r>
+        <w:t>IP address: 10.100.100.2</w:t>
+      </w:r>
+      <w:r>
+        <w:br/>
+        <w:t>Subnet Mask: 255.255.255.0</w:t>
+      </w:r>
+      <w:r>
+        <w:br/>
+        <w:t>Default Gateway: 10.100.100.1</w:t>
+      </w:r>
+      <w:r>
+        <w:br/>
+        <w:t>DNS server: 8.8.8.8</w:t>
+      </w:r>
+    </w:p>
+    <w:p>
+      <w:r>
+        <w:rPr>
+          <w:b/>
+          <w:bCs/>
+        </w:rPr>
+        <w:t>DNS server:</w:t>
+      </w:r>
+      <w:r>
+        <w:rPr>
+          <w:b/>
+          <w:bCs/>
+        </w:rPr>
+        <w:br/>
+      </w:r>
+      <w:r>
+        <w:t>IP address: 10.100.100.3</w:t>
+      </w:r>
+      <w:r>
+        <w:br/>
+        <w:t>Subnet Mask: 255.255.255.0</w:t>
+      </w:r>
+      <w:r>
+        <w:br/>
+        <w:t>Default Gateway: 10.100.100.1</w:t>
+      </w:r>
+      <w:r>
+        <w:br/>
+        <w:t>DNS server: 8.8.8.8</w:t>
+      </w:r>
+      <w:r>
+        <w:br/>
+      </w:r>
+    </w:p>
+    <w:p>
+      <w:r>
+        <w:rPr>
+          <w:b/>
+          <w:bCs/>
+        </w:rPr>
+        <w:t>WEB server:</w:t>
+      </w:r>
+      <w:r>
+        <w:rPr>
+          <w:b/>
+          <w:bCs/>
+        </w:rPr>
+        <w:br/>
+      </w:r>
+      <w:r>
+        <w:t>IP address: 10.100.100.4</w:t>
+      </w:r>
+      <w:r>
+        <w:br/>
+        <w:t>Subnet Mask: 255.255.255.0</w:t>
+      </w:r>
+      <w:r>
+        <w:br/>
+        <w:t>Default Gateway: 10.100.100.1</w:t>
+      </w:r>
+      <w:r>
+        <w:br/>
+      </w:r>
+      <w:r>
+        <w:lastRenderedPageBreak/>
+        <w:t>DNS server: 8.8.8.8</w:t>
+      </w:r>
+      <w:r>
+        <w:br/>
+      </w:r>
+    </w:p>
+    <w:p>
+      <w:pPr>
+        <w:rPr>
+          <w:rFonts w:ascii="-webkit-standard" w:hAnsi="-webkit-standard"/>
+          <w:b/>
+          <w:bCs/>
+          <w:color w:val="000000"/>
+          <w:sz w:val="32"/>
+          <w:szCs w:val="32"/>
+          <w:u w:val="single"/>
+        </w:rPr>
+      </w:pPr>
+      <w:r>
+        <w:rPr>
+          <w:rFonts w:ascii="-webkit-standard" w:hAnsi="-webkit-standard"/>
+          <w:b/>
+          <w:bCs/>
+          <w:color w:val="000000"/>
+          <w:sz w:val="32"/>
+          <w:szCs w:val="32"/>
+          <w:u w:val="single"/>
+        </w:rPr>
         <w:t>TESZTELESI</w:t>
       </w:r>
     </w:p>
@@ -2367,7 +2534,6 @@
           <w:b/>
           <w:bCs/>
         </w:rPr>
-        <w:lastRenderedPageBreak/>
         <w:t>GigabitEthernet0/0.62:</w:t>
       </w:r>
       <w:r>
@@ -2594,6 +2760,7 @@
         </w:numPr>
       </w:pPr>
       <w:r>
+        <w:lastRenderedPageBreak/>
         <w:t>Alapértelmezett átjáró: 192.168.60.33</w:t>
       </w:r>
     </w:p>
@@ -3178,6 +3345,7 @@
           <w:rFonts w:ascii="-webkit-standard" w:hAnsi="-webkit-standard"/>
           <w:color w:val="000000"/>
         </w:rPr>
+        <w:lastRenderedPageBreak/>
         <w:t>Rögzített MAC-címek:</w:t>
       </w:r>
     </w:p>
@@ -3393,7 +3561,6 @@
           <w:rFonts w:ascii="-webkit-standard" w:hAnsi="-webkit-standard"/>
           <w:color w:val="000000"/>
         </w:rPr>
-        <w:lastRenderedPageBreak/>
         <w:t>switchport trunk allowed vlan 60-62</w:t>
       </w:r>
       <w:r>
@@ -3418,7 +3585,7 @@
           <w:noProof/>
           <w:color w:val="000000"/>
         </w:rPr>
-        <w:pict w14:anchorId="6EAE5D88">
+        <w:pict w14:anchorId="277FDD79">
           <v:rect id="_x0000_i1026" alt="" style="width:453.6pt;height:.05pt;mso-width-percent:0;mso-height-percent:0;mso-width-percent:0;mso-height-percent:0" o:hralign="center" o:hrstd="t" o:hr="t" fillcolor="#a0a0a0" stroked="f"/>
         </w:pict>
       </w:r>
@@ -3727,6 +3894,7 @@
           <w:rFonts w:ascii="-webkit-standard" w:hAnsi="-webkit-standard"/>
           <w:color w:val="000000"/>
         </w:rPr>
+        <w:lastRenderedPageBreak/>
         <w:t>spanning-tree portfast</w:t>
       </w:r>
     </w:p>
@@ -3850,7 +4018,7 @@
           <w:noProof/>
           <w:color w:val="000000"/>
         </w:rPr>
-        <w:pict w14:anchorId="0A7DDF57">
+        <w:pict w14:anchorId="6ECEE2CA">
           <v:rect id="_x0000_i1025" alt="" style="width:453.6pt;height:.05pt;mso-width-percent:0;mso-height-percent:0;mso-width-percent:0;mso-height-percent:0" o:hralign="center" o:hrstd="t" o:hr="t" fillcolor="#a0a0a0" stroked="f"/>
         </w:pict>
       </w:r>
@@ -3909,7 +4077,6 @@
           <w:rFonts w:ascii="-webkit-standard" w:hAnsi="-webkit-standard"/>
           <w:color w:val="000000"/>
         </w:rPr>
-        <w:lastRenderedPageBreak/>
         <w:t>switchport access vlan 62</w:t>
       </w:r>
     </w:p>
@@ -4349,6 +4516,7 @@
           <w:lang w:eastAsia="hu-HU"/>
           <w14:ligatures w14:val="none"/>
         </w:rPr>
+        <w:lastRenderedPageBreak/>
         <w:t>DHCP szerver:</w:t>
       </w:r>
       <w:r>
@@ -4821,7 +4989,6 @@
           <w:lang w:eastAsia="hu-HU"/>
           <w14:ligatures w14:val="none"/>
         </w:rPr>
-        <w:lastRenderedPageBreak/>
         <w:t>192.168.30.0</w:t>
       </w:r>
     </w:p>
@@ -5250,6 +5417,302 @@
         </w:rPr>
         <w:t>DNS-szerver: 10.100.100.3</w:t>
       </w:r>
+    </w:p>
+    <w:p>
+      <w:pPr>
+        <w:spacing w:before="100" w:beforeAutospacing="1" w:after="100" w:afterAutospacing="1" w:line="240" w:lineRule="auto"/>
+        <w:rPr>
+          <w:rFonts w:ascii="Times New Roman" w:eastAsia="Times New Roman" w:hAnsi="Times New Roman" w:cs="Times New Roman"/>
+          <w:b/>
+          <w:bCs/>
+          <w:color w:val="000000"/>
+          <w:kern w:val="0"/>
+          <w:sz w:val="28"/>
+          <w:szCs w:val="28"/>
+          <w:u w:val="single"/>
+          <w:lang w:eastAsia="hu-HU"/>
+          <w14:ligatures w14:val="none"/>
+        </w:rPr>
+      </w:pPr>
+      <w:r>
+        <w:rPr>
+          <w:rFonts w:ascii="Times New Roman" w:eastAsia="Times New Roman" w:hAnsi="Times New Roman" w:cs="Times New Roman"/>
+          <w:b/>
+          <w:bCs/>
+          <w:color w:val="000000"/>
+          <w:kern w:val="0"/>
+          <w:sz w:val="28"/>
+          <w:szCs w:val="28"/>
+          <w:u w:val="single"/>
+          <w:lang w:eastAsia="hu-HU"/>
+          <w14:ligatures w14:val="none"/>
+        </w:rPr>
+        <w:t xml:space="preserve">HR SWITCH KONFIGURÁCIÓ </w:t>
+      </w:r>
+    </w:p>
+    <w:p>
+      <w:pPr>
+        <w:pStyle w:val="NormlWeb"/>
+        <w:rPr>
+          <w:color w:val="000000"/>
+          <w:u w:val="single"/>
+        </w:rPr>
+      </w:pPr>
+      <w:r>
+        <w:rPr>
+          <w:color w:val="000000"/>
+          <w:u w:val="single"/>
+        </w:rPr>
+        <w:t>Fő HR Switch</w:t>
+      </w:r>
+    </w:p>
+    <w:p>
+      <w:pPr>
+        <w:pStyle w:val="NormlWeb"/>
+        <w:rPr>
+          <w:b/>
+          <w:bCs/>
+          <w:color w:val="000000"/>
+        </w:rPr>
+      </w:pPr>
+      <w:r>
+        <w:rPr>
+          <w:b/>
+          <w:bCs/>
+          <w:color w:val="000000"/>
+        </w:rPr>
+        <w:t>VLAN létrehozás:</w:t>
+      </w:r>
+    </w:p>
+    <w:p>
+      <w:pPr>
+        <w:pStyle w:val="NormlWeb"/>
+        <w:rPr>
+          <w:color w:val="000000"/>
+        </w:rPr>
+      </w:pPr>
+      <w:r>
+        <w:rPr>
+          <w:color w:val="000000"/>
+        </w:rPr>
+        <w:t>vlan 30</w:t>
+      </w:r>
+      <w:r>
+        <w:rPr>
+          <w:color w:val="000000"/>
+        </w:rPr>
+        <w:br/>
+        <w:t>vlan 40</w:t>
+      </w:r>
+      <w:r>
+        <w:rPr>
+          <w:color w:val="000000"/>
+        </w:rPr>
+        <w:br/>
+        <w:t>vlan 50</w:t>
+      </w:r>
+    </w:p>
+    <w:p>
+      <w:pPr>
+        <w:pStyle w:val="NormlWeb"/>
+        <w:rPr>
+          <w:b/>
+          <w:bCs/>
+          <w:color w:val="000000"/>
+        </w:rPr>
+      </w:pPr>
+      <w:r>
+        <w:rPr>
+          <w:b/>
+          <w:bCs/>
+          <w:color w:val="000000"/>
+        </w:rPr>
+        <w:t>Trunk port a router felé:</w:t>
+      </w:r>
+    </w:p>
+    <w:p>
+      <w:pPr>
+        <w:pStyle w:val="NormlWeb"/>
+        <w:rPr>
+          <w:color w:val="000000"/>
+        </w:rPr>
+      </w:pPr>
+      <w:r>
+        <w:rPr>
+          <w:color w:val="000000"/>
+        </w:rPr>
+        <w:lastRenderedPageBreak/>
+        <w:t>interface FastEthernet0/1</w:t>
+      </w:r>
+      <w:r>
+        <w:rPr>
+          <w:color w:val="000000"/>
+        </w:rPr>
+        <w:br/>
+        <w:t>switchport mode trunk</w:t>
+      </w:r>
+      <w:r>
+        <w:rPr>
+          <w:color w:val="000000"/>
+        </w:rPr>
+        <w:br/>
+        <w:t>switchport trunk allowed vlan 30,40,50</w:t>
+      </w:r>
+    </w:p>
+    <w:p>
+      <w:pPr>
+        <w:pStyle w:val="NormlWeb"/>
+        <w:rPr>
+          <w:b/>
+          <w:bCs/>
+          <w:color w:val="000000"/>
+        </w:rPr>
+      </w:pPr>
+      <w:r>
+        <w:rPr>
+          <w:b/>
+          <w:bCs/>
+          <w:color w:val="000000"/>
+        </w:rPr>
+        <w:t>Access portok:</w:t>
+      </w:r>
+    </w:p>
+    <w:p>
+      <w:pPr>
+        <w:pStyle w:val="NormlWeb"/>
+        <w:rPr>
+          <w:color w:val="000000"/>
+        </w:rPr>
+      </w:pPr>
+      <w:r>
+        <w:rPr>
+          <w:color w:val="000000"/>
+        </w:rPr>
+        <w:t>Fa0/2-5 → VLAN 30</w:t>
+      </w:r>
+      <w:r>
+        <w:rPr>
+          <w:color w:val="000000"/>
+        </w:rPr>
+        <w:br/>
+        <w:t>Fa0/6-8 → VLAN 40</w:t>
+      </w:r>
+      <w:r>
+        <w:rPr>
+          <w:color w:val="000000"/>
+        </w:rPr>
+        <w:br/>
+        <w:t>Fa0/9-10 → VLAN 50</w:t>
+      </w:r>
+    </w:p>
+    <w:p>
+      <w:pPr>
+        <w:pStyle w:val="NormlWeb"/>
+        <w:rPr>
+          <w:b/>
+          <w:bCs/>
+          <w:color w:val="000000"/>
+        </w:rPr>
+      </w:pPr>
+      <w:r>
+        <w:rPr>
+          <w:b/>
+          <w:bCs/>
+          <w:color w:val="000000"/>
+        </w:rPr>
+        <w:t>Port security:</w:t>
+      </w:r>
+    </w:p>
+    <w:p>
+      <w:pPr>
+        <w:pStyle w:val="NormlWeb"/>
+        <w:rPr>
+          <w:color w:val="000000"/>
+        </w:rPr>
+      </w:pPr>
+      <w:r>
+        <w:rPr>
+          <w:color w:val="000000"/>
+        </w:rPr>
+        <w:t>switchport port-security</w:t>
+      </w:r>
+      <w:r>
+        <w:rPr>
+          <w:color w:val="000000"/>
+        </w:rPr>
+        <w:br/>
+        <w:t>switchport port-security maximum 2</w:t>
+      </w:r>
+      <w:r>
+        <w:rPr>
+          <w:color w:val="000000"/>
+        </w:rPr>
+        <w:br/>
+        <w:t>switchport port-security mac-address sticky</w:t>
+      </w:r>
+      <w:r>
+        <w:rPr>
+          <w:color w:val="000000"/>
+        </w:rPr>
+        <w:br/>
+        <w:t>switchport port-security violation restrict</w:t>
+      </w:r>
+    </w:p>
+    <w:p>
+      <w:pPr>
+        <w:pStyle w:val="NormlWeb"/>
+        <w:rPr>
+          <w:b/>
+          <w:bCs/>
+          <w:color w:val="000000"/>
+        </w:rPr>
+      </w:pPr>
+      <w:r>
+        <w:rPr>
+          <w:b/>
+          <w:bCs/>
+          <w:color w:val="000000"/>
+        </w:rPr>
+        <w:t>Spanning-tree:</w:t>
+      </w:r>
+    </w:p>
+    <w:p>
+      <w:pPr>
+        <w:pStyle w:val="NormlWeb"/>
+        <w:rPr>
+          <w:color w:val="000000"/>
+        </w:rPr>
+      </w:pPr>
+      <w:r>
+        <w:rPr>
+          <w:color w:val="000000"/>
+        </w:rPr>
+        <w:t>spanning-tree portfast</w:t>
+      </w:r>
+      <w:r>
+        <w:rPr>
+          <w:color w:val="000000"/>
+        </w:rPr>
+        <w:br/>
+        <w:t>spanning-tree bpduguard enable</w:t>
+      </w:r>
+    </w:p>
+    <w:p>
+      <w:pPr>
+        <w:spacing w:before="100" w:beforeAutospacing="1" w:after="100" w:afterAutospacing="1" w:line="240" w:lineRule="auto"/>
+        <w:rPr>
+          <w:rFonts w:ascii="Times New Roman" w:eastAsia="Times New Roman" w:hAnsi="Times New Roman" w:cs="Times New Roman"/>
+          <w:b/>
+          <w:bCs/>
+          <w:color w:val="000000"/>
+          <w:kern w:val="0"/>
+          <w:sz w:val="28"/>
+          <w:szCs w:val="28"/>
+          <w:u w:val="single"/>
+          <w:lang w:eastAsia="hu-HU"/>
+          <w14:ligatures w14:val="none"/>
+        </w:rPr>
+      </w:pPr>
     </w:p>
     <w:p>
       <w:pPr>
@@ -5828,6 +6291,351 @@
           <w:rFonts w:ascii="Times New Roman" w:eastAsia="Times New Roman" w:hAnsi="Times New Roman" w:cs="Times New Roman"/>
           <w:color w:val="000000"/>
           <w:kern w:val="0"/>
+          <w:lang w:eastAsia="hu-HU"/>
+          <w14:ligatures w14:val="none"/>
+        </w:rPr>
+      </w:pPr>
+    </w:p>
+    <w:p>
+      <w:pPr>
+        <w:spacing w:before="100" w:beforeAutospacing="1" w:after="100" w:afterAutospacing="1" w:line="240" w:lineRule="auto"/>
+        <w:rPr>
+          <w:rFonts w:ascii="Times New Roman" w:eastAsia="Times New Roman" w:hAnsi="Times New Roman" w:cs="Times New Roman"/>
+          <w:b/>
+          <w:bCs/>
+          <w:color w:val="000000"/>
+          <w:kern w:val="0"/>
+          <w:sz w:val="32"/>
+          <w:szCs w:val="32"/>
+          <w:u w:val="single"/>
+          <w:lang w:eastAsia="hu-HU"/>
+          <w14:ligatures w14:val="none"/>
+        </w:rPr>
+      </w:pPr>
+      <w:r>
+        <w:rPr>
+          <w:rFonts w:ascii="Times New Roman" w:eastAsia="Times New Roman" w:hAnsi="Times New Roman" w:cs="Times New Roman"/>
+          <w:b/>
+          <w:bCs/>
+          <w:color w:val="000000"/>
+          <w:kern w:val="0"/>
+          <w:sz w:val="32"/>
+          <w:szCs w:val="32"/>
+          <w:u w:val="single"/>
+          <w:lang w:eastAsia="hu-HU"/>
+          <w14:ligatures w14:val="none"/>
+        </w:rPr>
+        <w:lastRenderedPageBreak/>
+        <w:t>ASA T</w:t>
+      </w:r>
+      <w:r>
+        <w:rPr>
+          <w:rFonts w:ascii="Times New Roman" w:eastAsia="Times New Roman" w:hAnsi="Times New Roman" w:cs="Times New Roman"/>
+          <w:b/>
+          <w:bCs/>
+          <w:color w:val="000000"/>
+          <w:kern w:val="0"/>
+          <w:sz w:val="32"/>
+          <w:szCs w:val="32"/>
+          <w:u w:val="single"/>
+          <w:lang w:eastAsia="hu-HU"/>
+          <w14:ligatures w14:val="none"/>
+        </w:rPr>
+        <w:t>Ű</w:t>
+      </w:r>
+      <w:r>
+        <w:rPr>
+          <w:rFonts w:ascii="Times New Roman" w:eastAsia="Times New Roman" w:hAnsi="Times New Roman" w:cs="Times New Roman"/>
+          <w:b/>
+          <w:bCs/>
+          <w:color w:val="000000"/>
+          <w:kern w:val="0"/>
+          <w:sz w:val="32"/>
+          <w:szCs w:val="32"/>
+          <w:u w:val="single"/>
+          <w:lang w:eastAsia="hu-HU"/>
+          <w14:ligatures w14:val="none"/>
+        </w:rPr>
+        <w:t>ZFAL</w:t>
+      </w:r>
+    </w:p>
+    <w:p>
+      <w:pPr>
+        <w:pStyle w:val="NormlWeb"/>
+        <w:rPr>
+          <w:color w:val="000000"/>
+        </w:rPr>
+      </w:pPr>
+      <w:r>
+        <w:rPr>
+          <w:color w:val="000000"/>
+        </w:rPr>
+        <w:t>ASA 5505</w:t>
+      </w:r>
+    </w:p>
+    <w:p>
+      <w:pPr>
+        <w:pStyle w:val="NormlWeb"/>
+        <w:rPr>
+          <w:b/>
+          <w:bCs/>
+          <w:color w:val="000000"/>
+        </w:rPr>
+      </w:pPr>
+      <w:r>
+        <w:rPr>
+          <w:b/>
+          <w:bCs/>
+          <w:color w:val="000000"/>
+        </w:rPr>
+        <w:t>Alap</w:t>
+      </w:r>
+    </w:p>
+    <w:p>
+      <w:pPr>
+        <w:pStyle w:val="NormlWeb"/>
+        <w:rPr>
+          <w:color w:val="000000"/>
+        </w:rPr>
+      </w:pPr>
+      <w:r>
+        <w:rPr>
+          <w:color w:val="000000"/>
+        </w:rPr>
+        <w:t>Hostname: ASA</w:t>
+      </w:r>
+      <w:r>
+        <w:rPr>
+          <w:color w:val="000000"/>
+        </w:rPr>
+        <w:br/>
+        <w:t>IOS verzió: 9.x</w:t>
+      </w:r>
+      <w:r>
+        <w:rPr>
+          <w:color w:val="000000"/>
+        </w:rPr>
+        <w:br/>
+        <w:t>Szerep: Külső–belső forgalom szűrése, NAT biztosítása</w:t>
+      </w:r>
+    </w:p>
+    <w:p>
+      <w:pPr>
+        <w:pStyle w:val="NormlWeb"/>
+        <w:rPr>
+          <w:b/>
+          <w:bCs/>
+          <w:color w:val="000000"/>
+        </w:rPr>
+      </w:pPr>
+      <w:r>
+        <w:rPr>
+          <w:b/>
+          <w:bCs/>
+          <w:color w:val="000000"/>
+        </w:rPr>
+        <w:t>Interfészek</w:t>
+      </w:r>
+    </w:p>
+    <w:p>
+      <w:pPr>
+        <w:pStyle w:val="NormlWeb"/>
+        <w:rPr>
+          <w:color w:val="000000"/>
+        </w:rPr>
+      </w:pPr>
+      <w:r>
+        <w:rPr>
+          <w:color w:val="000000"/>
+        </w:rPr>
+        <w:t>GigabitEthernet0/0</w:t>
+      </w:r>
+      <w:r>
+        <w:rPr>
+          <w:color w:val="000000"/>
+        </w:rPr>
+        <w:br/>
+        <w:t>nameif outside</w:t>
+      </w:r>
+      <w:r>
+        <w:rPr>
+          <w:color w:val="000000"/>
+        </w:rPr>
+        <w:br/>
+        <w:t>security-level 0</w:t>
+      </w:r>
+      <w:r>
+        <w:rPr>
+          <w:color w:val="000000"/>
+        </w:rPr>
+        <w:br/>
+        <w:t>ip address 10.0.16.2 255.255.255.252</w:t>
+      </w:r>
+    </w:p>
+    <w:p>
+      <w:pPr>
+        <w:pStyle w:val="NormlWeb"/>
+        <w:rPr>
+          <w:color w:val="000000"/>
+        </w:rPr>
+      </w:pPr>
+      <w:r>
+        <w:rPr>
+          <w:color w:val="000000"/>
+        </w:rPr>
+        <w:t>GigabitEthernet0/1</w:t>
+      </w:r>
+      <w:r>
+        <w:rPr>
+          <w:color w:val="000000"/>
+        </w:rPr>
+        <w:br/>
+        <w:t>nameif inside</w:t>
+      </w:r>
+      <w:r>
+        <w:rPr>
+          <w:color w:val="000000"/>
+        </w:rPr>
+        <w:br/>
+        <w:t>security-level 100</w:t>
+      </w:r>
+      <w:r>
+        <w:rPr>
+          <w:color w:val="000000"/>
+        </w:rPr>
+        <w:br/>
+        <w:t>ip address 192.168.4.254 255.255.255.0</w:t>
+      </w:r>
+    </w:p>
+    <w:p>
+      <w:pPr>
+        <w:pStyle w:val="NormlWeb"/>
+        <w:rPr>
+          <w:b/>
+          <w:bCs/>
+          <w:color w:val="000000"/>
+        </w:rPr>
+      </w:pPr>
+      <w:r>
+        <w:rPr>
+          <w:b/>
+          <w:bCs/>
+          <w:color w:val="000000"/>
+        </w:rPr>
+        <w:t>NAT beállítás</w:t>
+      </w:r>
+    </w:p>
+    <w:p>
+      <w:pPr>
+        <w:pStyle w:val="NormlWeb"/>
+        <w:rPr>
+          <w:color w:val="000000"/>
+        </w:rPr>
+      </w:pPr>
+      <w:r>
+        <w:rPr>
+          <w:color w:val="000000"/>
+        </w:rPr>
+        <w:t>object network ADMIN-LAN</w:t>
+      </w:r>
+      <w:r>
+        <w:rPr>
+          <w:color w:val="000000"/>
+        </w:rPr>
+        <w:br/>
+        <w:t>subnet 192.168.4.0 255.255.255.0</w:t>
+      </w:r>
+      <w:r>
+        <w:rPr>
+          <w:color w:val="000000"/>
+        </w:rPr>
+        <w:br/>
+        <w:t>nat (inside,outside) dynamic interface</w:t>
+      </w:r>
+    </w:p>
+    <w:p>
+      <w:pPr>
+        <w:pStyle w:val="NormlWeb"/>
+        <w:rPr>
+          <w:b/>
+          <w:bCs/>
+          <w:color w:val="000000"/>
+        </w:rPr>
+      </w:pPr>
+      <w:r>
+        <w:rPr>
+          <w:b/>
+          <w:bCs/>
+          <w:color w:val="000000"/>
+        </w:rPr>
+        <w:t>Alapértelmezett útvonal</w:t>
+      </w:r>
+    </w:p>
+    <w:p>
+      <w:pPr>
+        <w:pStyle w:val="NormlWeb"/>
+        <w:rPr>
+          <w:color w:val="000000"/>
+        </w:rPr>
+      </w:pPr>
+      <w:r>
+        <w:rPr>
+          <w:color w:val="000000"/>
+        </w:rPr>
+        <w:t>route outside 0.0.0.0 0.0.0.0 10.0.16.1</w:t>
+      </w:r>
+    </w:p>
+    <w:p>
+      <w:pPr>
+        <w:pStyle w:val="NormlWeb"/>
+        <w:rPr>
+          <w:b/>
+          <w:bCs/>
+          <w:color w:val="000000"/>
+        </w:rPr>
+      </w:pPr>
+      <w:r>
+        <w:rPr>
+          <w:b/>
+          <w:bCs/>
+          <w:color w:val="000000"/>
+        </w:rPr>
+        <w:t>Hozzáférési szabály</w:t>
+      </w:r>
+    </w:p>
+    <w:p>
+      <w:pPr>
+        <w:pStyle w:val="NormlWeb"/>
+        <w:rPr>
+          <w:color w:val="000000"/>
+        </w:rPr>
+      </w:pPr>
+      <w:r>
+        <w:rPr>
+          <w:color w:val="000000"/>
+        </w:rPr>
+        <w:t>access-list OUTSIDE-IN extended permit icmp any any</w:t>
+      </w:r>
+      <w:r>
+        <w:rPr>
+          <w:color w:val="000000"/>
+        </w:rPr>
+        <w:br/>
+        <w:t>access-group OUTSIDE-IN in interface outside</w:t>
+      </w:r>
+    </w:p>
+    <w:p>
+      <w:pPr>
+        <w:spacing w:before="100" w:beforeAutospacing="1" w:after="100" w:afterAutospacing="1" w:line="240" w:lineRule="auto"/>
+        <w:rPr>
+          <w:rFonts w:ascii="Times New Roman" w:eastAsia="Times New Roman" w:hAnsi="Times New Roman" w:cs="Times New Roman"/>
+          <w:b/>
+          <w:bCs/>
+          <w:color w:val="000000"/>
+          <w:kern w:val="0"/>
+          <w:sz w:val="32"/>
+          <w:szCs w:val="32"/>
+          <w:u w:val="single"/>
           <w:lang w:eastAsia="hu-HU"/>
           <w14:ligatures w14:val="none"/>
         </w:rPr>

</xml_diff>